<commit_message>
Live Solver: best ROI layout and top/bottom cell cores
- Score_per_Million_USD (composite score per $1M spent), a Best_ROI flag, and the
  marginal score per extra $1M along the cost frontier
- Best ROI value box and map; the best ROI run is circled on the cost-vs-score plot
  with a dashed line from the origin; its maps are saved to Best_ROI_Maps
- Results tab: one map of the cells used by at least a cut-off share (default 50%)
  of the top runs (blue), the bottom runs (orange) or both (gray), for the top/bottom
  5-25% (default 10%), with a random-runs-only option, a table and a CSV download
- Cell_Frequency folder (CSV, share maps and core map) written when a session ends
- README and user guide (sections 8, 9.3-9.6) updated

Co-Authored-By: Claude Opus 5.5 <noreply@anthropic.com>
Claude-Session: https://claude.ai/code/session_01DDfDXAecEABbTAEvadafNS
</commit_message>
<xml_diff>
--- a/docs/LiveSolver_User_Guide.docx
+++ b/docs/LiveSolver_User_Guide.docx
@@ -1928,7 +1928,7 @@
         </w:numPr>
       </w:pPr>
       <w:r>
-        <w:t xml:space="preserve">Watch the four boxes at the top (status, progress, best score, cost of the best run), the two score plots and the two maps update after each scenario.</w:t>
+        <w:t xml:space="preserve">Watch the five boxes at the top (status, progress, best score, cost of the best run, best return on investment), the two score plots and the three maps update after each scenario.</w:t>
       </w:r>
     </w:p>
     <w:p>
@@ -5335,7 +5335,7 @@
         <w:rPr>
           <w:b/>
         </w:rPr>
-        <w:t xml:space="preserve">The four boxes at the top</w:t>
+        <w:t xml:space="preserve">The five boxes at the top</w:t>
       </w:r>
     </w:p>
     <w:tbl>
@@ -5346,8 +5346,8 @@
         <w:tblLook w:val="04A0" w:firstRow="1" w:lastRow="0" w:firstColumn="0" w:lastColumn="0" w:noHBand="0" w:noVBand="1"/>
       </w:tblPr>
       <w:tblGrid>
-        <w:gridCol w:w="3152"/>
-        <w:gridCol w:w="6207"/>
+        <w:gridCol w:w="3465"/>
+        <w:gridCol w:w="5894"/>
       </w:tblGrid>
       <w:tr>
         <w:trPr>
@@ -5355,7 +5355,7 @@
         </w:trPr>
         <w:tc>
           <w:tcPr>
-            <w:tcW w:w="3152" w:type="dxa"/>
+            <w:tcW w:w="3465" w:type="dxa"/>
             <w:shd w:val="clear" w:color="auto" w:fill="F2F2F2"/>
           </w:tcPr>
           <w:p>
@@ -5367,7 +5367,7 @@
         </w:tc>
         <w:tc>
           <w:tcPr>
-            <w:tcW w:w="6207" w:type="dxa"/>
+            <w:tcW w:w="5894" w:type="dxa"/>
             <w:shd w:val="clear" w:color="auto" w:fill="F2F2F2"/>
           </w:tcPr>
           <w:p>
@@ -5381,7 +5381,7 @@
       <w:tr>
         <w:tc>
           <w:tcPr>
-            <w:tcW w:w="3152" w:type="dxa"/>
+            <w:tcW w:w="3465" w:type="dxa"/>
           </w:tcPr>
           <w:p>
             <w:pPr/>
@@ -5395,7 +5395,7 @@
         </w:tc>
         <w:tc>
           <w:tcPr>
-            <w:tcW w:w="6207" w:type="dxa"/>
+            <w:tcW w:w="5894" w:type="dxa"/>
           </w:tcPr>
           <w:p>
             <w:pPr/>
@@ -5408,7 +5408,7 @@
       <w:tr>
         <w:tc>
           <w:tcPr>
-            <w:tcW w:w="3152" w:type="dxa"/>
+            <w:tcW w:w="3465" w:type="dxa"/>
           </w:tcPr>
           <w:p>
             <w:pPr/>
@@ -5422,7 +5422,7 @@
         </w:tc>
         <w:tc>
           <w:tcPr>
-            <w:tcW w:w="6207" w:type="dxa"/>
+            <w:tcW w:w="5894" w:type="dxa"/>
           </w:tcPr>
           <w:p>
             <w:pPr/>
@@ -5435,7 +5435,7 @@
       <w:tr>
         <w:tc>
           <w:tcPr>
-            <w:tcW w:w="3152" w:type="dxa"/>
+            <w:tcW w:w="3465" w:type="dxa"/>
           </w:tcPr>
           <w:p>
             <w:pPr/>
@@ -5449,7 +5449,7 @@
         </w:tc>
         <w:tc>
           <w:tcPr>
-            <w:tcW w:w="6207" w:type="dxa"/>
+            <w:tcW w:w="5894" w:type="dxa"/>
           </w:tcPr>
           <w:p>
             <w:pPr/>
@@ -5462,7 +5462,7 @@
       <w:tr>
         <w:tc>
           <w:tcPr>
-            <w:tcW w:w="3152" w:type="dxa"/>
+            <w:tcW w:w="3465" w:type="dxa"/>
           </w:tcPr>
           <w:p>
             <w:pPr/>
@@ -5476,12 +5476,39 @@
         </w:tc>
         <w:tc>
           <w:tcPr>
-            <w:tcW w:w="6207" w:type="dxa"/>
+            <w:tcW w:w="5894" w:type="dxa"/>
           </w:tcPr>
           <w:p>
             <w:pPr/>
             <w:r>
               <w:t xml:space="preserve">The cost of that scenario, the number of modules and cells, and any removals.</w:t>
+            </w:r>
+          </w:p>
+        </w:tc>
+      </w:tr>
+      <w:tr>
+        <w:tc>
+          <w:tcPr>
+            <w:tcW w:w="3465" w:type="dxa"/>
+          </w:tcPr>
+          <w:p>
+            <w:pPr/>
+            <w:r>
+              <w:rPr>
+                <w:b/>
+              </w:rPr>
+              <w:t xml:space="preserve">Best ROI (score per $1M)</w:t>
+            </w:r>
+          </w:p>
+        </w:tc>
+        <w:tc>
+          <w:tcPr>
+            <w:tcW w:w="5894" w:type="dxa"/>
+          </w:tcPr>
+          <w:p>
+            <w:pPr/>
+            <w:r>
+              <w:t xml:space="preserve">The highest composite score gained per $1 million spent, which scenario it is, its score and its cost (Section 9.5).</w:t>
             </w:r>
           </w:p>
         </w:tc>
@@ -5723,7 +5750,7 @@
         <w:t xml:space="preserve">Cost vs. score (frontier highlighted)</w:t>
       </w:r>
       <w:r>
-        <w:t xml:space="preserve">: each scenario's cost against its score. Red dots joined by a step line form the cost frontier, the best score available at each budget. The gray dashed line again marks the status quo.</w:t>
+        <w:t xml:space="preserve">: each scenario's cost against its score. Red dots joined by a step line form the cost frontier, the best score available at each budget. The gray dashed line again marks the status quo. The best-ROI scenario is circled in green, and a second gray dashed line runs from the origin through it.</w:t>
       </w:r>
     </w:p>
     <w:p>
@@ -5750,7 +5777,7 @@
         <w:t xml:space="preserve">Running</w:t>
       </w:r>
       <w:r>
-        <w:t xml:space="preserve"> maps: the best scenario so far and the one being simulated. New reef cells are outlined in orange and removed ones in magenta with a cross; blue shading shows the reef cover of each cell.</w:t>
+        <w:t xml:space="preserve"> maps: the best scenario so far and the one being simulated, with the Best ROI layout (Section 9.5) between them. New reef cells are outlined in orange and removed ones in magenta with a cross; blue shading shows the reef cover of each cell.</w:t>
       </w:r>
     </w:p>
     <w:p>
@@ -6227,6 +6254,75 @@
           </w:p>
         </w:tc>
       </w:tr>
+      <w:tr>
+        <w:tc>
+          <w:tcPr>
+            <w:tcW w:w="3629" w:type="dxa"/>
+          </w:tcPr>
+          <w:p>
+            <w:pPr/>
+            <w:r>
+              <w:rPr>
+                <w:rStyle w:val="CodeChar"/>
+              </w:rPr>
+              <w:t xml:space="preserve">Best_ROI_Maps\</w:t>
+            </w:r>
+          </w:p>
+        </w:tc>
+        <w:tc>
+          <w:tcPr>
+            <w:tcW w:w="5730" w:type="dxa"/>
+          </w:tcPr>
+          <w:p>
+            <w:pPr/>
+            <w:r>
+              <w:t xml:space="preserve">The habitat maps of the best return-on-investment scenario.</w:t>
+            </w:r>
+          </w:p>
+        </w:tc>
+      </w:tr>
+      <w:tr>
+        <w:tc>
+          <w:tcPr>
+            <w:tcW w:w="3629" w:type="dxa"/>
+          </w:tcPr>
+          <w:p>
+            <w:pPr/>
+            <w:r>
+              <w:rPr>
+                <w:rStyle w:val="CodeChar"/>
+              </w:rPr>
+              <w:t xml:space="preserve">Cell_Frequency\</w:t>
+            </w:r>
+          </w:p>
+        </w:tc>
+        <w:tc>
+          <w:tcPr>
+            <w:tcW w:w="5730" w:type="dxa"/>
+          </w:tcPr>
+          <w:p>
+            <w:pPr/>
+            <w:r>
+              <w:rPr>
+                <w:rStyle w:val="CodeChar"/>
+              </w:rPr>
+              <w:t xml:space="preserve">cell_frequency.csv</w:t>
+            </w:r>
+            <w:r>
+              <w:t xml:space="preserve"> (every cell any scenario used, with its share of the top 10%, bottom 10% and all scenarios and its core group at the 50% cut-off), ASCII maps of those shares, and the core map </w:t>
+            </w:r>
+            <w:r>
+              <w:rPr>
+                <w:rStyle w:val="CodeChar"/>
+              </w:rPr>
+              <w:t xml:space="preserve">install_core_top_bottom10_cut50.asc</w:t>
+            </w:r>
+            <w:r>
+              <w:t xml:space="preserve"> (1 = top, 2 = bottom, 3 = both) for GIS (Section 9.6).</w:t>
+            </w:r>
+          </w:p>
+        </w:tc>
+      </w:tr>
     </w:tbl>
     <w:p>
       <w:pPr>
@@ -6808,7 +6904,7 @@
           <w:p>
             <w:pPr/>
             <w:r>
-              <w:t xml:space="preserve">The composite score and whether the scenario is on the Pareto front or the cost frontier.</w:t>
+              <w:t xml:space="preserve">The composite score and whether the scenario is on the Pareto front or the cost frontier. Score_per_Million_USD is the composite score per $1 million spent, Best_ROI marks the scenario with the highest value, and Marginal_Score_per_Million_USD (cost-frontier scenarios only) is the extra score per extra $1 million over the next cheaper frontier scenario (Section 9.5).</w:t>
             </w:r>
           </w:p>
         </w:tc>
@@ -6933,39 +7029,55 @@
     </w:tbl>
     <w:p>
       <w:pPr>
-        <w:pStyle w:val="Heading2"/>
-      </w:pPr>
-      <w:r>
-        <w:t xml:space="preserve">10. How the Solver works</w:t>
+        <w:pStyle w:val="Heading3"/>
+      </w:pPr>
+      <w:r>
+        <w:t xml:space="preserve">9.5 Best return on investment</w:t>
       </w:r>
     </w:p>
     <w:p>
       <w:pPr/>
       <w:r>
-        <w:t xml:space="preserve">This section documents the calculations behind each scenario for readers who want to evaluate or reproduce the method. Symbols refer to the settings in Section 7.</w:t>
-      </w:r>
-    </w:p>
-    <w:p>
-      <w:pPr>
-        <w:pStyle w:val="Heading3"/>
-      </w:pPr>
-      <w:r>
-        <w:t xml:space="preserve">10.1 Existing reef baseline</w:t>
+        <w:t xml:space="preserve">The best layout is the one with the highest composite score, whatever it costs. The </w:t>
+      </w:r>
+      <w:r>
+        <w:rPr>
+          <w:b/>
+        </w:rPr>
+        <w:t xml:space="preserve">best return on investment (ROI)</w:t>
+      </w:r>
+      <w:r>
+        <w:t xml:space="preserve"> is the scenario that gains the most score for each dollar spent:</w:t>
       </w:r>
     </w:p>
     <w:p>
       <w:pPr/>
       <w:r>
-        <w:t xml:space="preserve">The status-quo reef cover is built from the Florida Fish and Wildlife Conservation Commission's artificial reef deployment records (</w:t>
-      </w:r>
-      <w:r>
         <w:rPr>
           <w:rStyle w:val="CodeChar"/>
         </w:rPr>
-        <w:t xml:space="preserve">reeflocations.csv</w:t>
-      </w:r>
-      <w:r>
-        <w:t xml:space="preserve">), as in the original optimisation workflow:</w:t>
+        <w:t xml:space="preserve">Score per $1M = composite score ÷ (total cost ÷ 1,000,000)</w:t>
+      </w:r>
+    </w:p>
+    <w:p>
+      <w:pPr/>
+      <w:r>
+        <w:t xml:space="preserve">Only scenarios that cost something and score above the status quo are considered. The best ROI scenario has its own box and map on the </w:t>
+      </w:r>
+      <w:r>
+        <w:rPr>
+          <w:b/>
+        </w:rPr>
+        <w:t xml:space="preserve">Live solver</w:t>
+      </w:r>
+      <w:r>
+        <w:t xml:space="preserve"> tab and is circled in green on the cost-vs-score plot. The gray dashed line from the origin (the status quo: no cost, score 0) through that point is the steepest such line any scenario reaches.</w:t>
+      </w:r>
+    </w:p>
+    <w:p>
+      <w:pPr/>
+      <w:r>
+        <w:t xml:space="preserve">Read it with care:</w:t>
       </w:r>
     </w:p>
     <w:p>
@@ -6977,7 +7089,7 @@
         </w:numPr>
       </w:pPr>
       <w:r>
-        <w:t xml:space="preserve">Each deployment with coordinates inside the model grid (1,126 of 4,548 records for NGoM) is assigned to its cell.</w:t>
+        <w:t xml:space="preserve">The ratio favours small projects. A cheap scenario with a modest gain can have the best ratio but deliver far less in total than a larger project.</w:t>
       </w:r>
     </w:p>
     <w:p>
@@ -6989,7 +7101,22 @@
         </w:numPr>
       </w:pPr>
       <w:r>
-        <w:t xml:space="preserve">Each cell is divided into a 10 m sub-grid. A deployment covers every sub-grid point within the halo radius (default 500 m) of its position.</w:t>
+        <w:rPr>
+          <w:b/>
+        </w:rPr>
+        <w:t xml:space="preserve">Marginal ROI</w:t>
+      </w:r>
+      <w:r>
+        <w:t xml:space="preserve"> answers a different question: how much does the next million dollars buy? For each scenario on the cost frontier, </w:t>
+      </w:r>
+      <w:r>
+        <w:rPr>
+          <w:rStyle w:val="CodeChar"/>
+        </w:rPr>
+        <w:t xml:space="preserve">Marginal_Score_per_Million_USD</w:t>
+      </w:r>
+      <w:r>
+        <w:t xml:space="preserve"> is the extra score divided by the extra cost compared with the next cheaper frontier scenario. Where it falls steeply, spending more stops paying off; that point is often a sensible budget.</w:t>
       </w:r>
     </w:p>
     <w:p>
@@ -7001,7 +7128,66 @@
         </w:numPr>
       </w:pPr>
       <w:r>
-        <w:t xml:space="preserve">A cell's reef cover is the share of its sub-grid points covered by at least one deployment.</w:t>
+        <w:t xml:space="preserve">For a monetary return, use </w:t>
+      </w:r>
+      <w:r>
+        <w:rPr>
+          <w:rStyle w:val="CodeChar"/>
+        </w:rPr>
+        <w:t xml:space="preserve">USD_Gained_Per_USD</w:t>
+      </w:r>
+      <w:r>
+        <w:t xml:space="preserve"> (revenue gain ÷ cost) and </w:t>
+      </w:r>
+      <w:r>
+        <w:rPr>
+          <w:rStyle w:val="CodeChar"/>
+        </w:rPr>
+        <w:t xml:space="preserve">Years_To_Benefit</w:t>
+      </w:r>
+      <w:r>
+        <w:t xml:space="preserve"> (cost ÷ annual revenue gain, the payback period).</w:t>
+      </w:r>
+    </w:p>
+    <w:p>
+      <w:pPr>
+        <w:pStyle w:val="Heading3"/>
+      </w:pPr>
+      <w:r>
+        <w:t xml:space="preserve">9.6 Cells used by the best and worst runs</w:t>
+      </w:r>
+    </w:p>
+    <w:p>
+      <w:pPr/>
+      <w:r>
+        <w:t xml:space="preserve">A single best scenario can owe part of its score to chance. A cell that keeps turning up in the best scenarios, and seldom in the worst, is a more reliable place to build. The card </w:t>
+      </w:r>
+      <w:r>
+        <w:rPr>
+          <w:b/>
+        </w:rPr>
+        <w:t xml:space="preserve">Cells used by the best and worst runs</w:t>
+      </w:r>
+      <w:r>
+        <w:t xml:space="preserve"> on the </w:t>
+      </w:r>
+      <w:r>
+        <w:rPr>
+          <w:b/>
+        </w:rPr>
+        <w:t xml:space="preserve">Results</w:t>
+      </w:r>
+      <w:r>
+        <w:t xml:space="preserve"> tab ranks the scored scenarios and takes the top and bottom groups (5, 10, 20 or 25%; 10% by default). A cell is in a group's </w:t>
+      </w:r>
+      <w:r>
+        <w:rPr>
+          <w:i/>
+        </w:rPr>
+        <w:t xml:space="preserve">core</w:t>
+      </w:r>
+      <w:r>
+        <w:t xml:space="preserve"> when at least the cut-off share of that group's scenarios (50% by default, adjustable from 10 to 100%) placed structure there.</w:t>
       </w:r>
     </w:p>
     <w:p>
@@ -7009,20 +7195,38 @@
         <w:pStyle w:val="ListParagraph"/>
         <w:numPr>
           <w:ilvl w:val="0"/>
-          <w:numId w:val="12"/>
+          <w:numId w:val="13"/>
         </w:numPr>
       </w:pPr>
       <w:r>
-        <w:t xml:space="preserve">The Alabama Artificial Reef Zone has no point data. Its reef cells, those marked in </w:t>
-      </w:r>
-      <w:r>
-        <w:rPr>
-          <w:rStyle w:val="CodeChar"/>
-        </w:rPr>
-        <w:t xml:space="preserve">structures_init.asc</w:t>
-      </w:r>
-      <w:r>
-        <w:t xml:space="preserve"> in the 19 westernmost columns, receive the mean cover of the Florida reef cells (15.9% with the defaults).</w:t>
+        <w:t xml:space="preserve">One map shows the top core in </w:t>
+      </w:r>
+      <w:r>
+        <w:rPr>
+          <w:b/>
+        </w:rPr>
+        <w:t xml:space="preserve">blue</w:t>
+      </w:r>
+      <w:r>
+        <w:t xml:space="preserve">, the bottom core in </w:t>
+      </w:r>
+      <w:r>
+        <w:rPr>
+          <w:b/>
+        </w:rPr>
+        <w:t xml:space="preserve">orange</w:t>
+      </w:r>
+      <w:r>
+        <w:t xml:space="preserve">, and cells in both cores in </w:t>
+      </w:r>
+      <w:r>
+        <w:rPr>
+          <w:b/>
+        </w:rPr>
+        <w:t xml:space="preserve">gray</w:t>
+      </w:r>
+      <w:r>
+        <w:t xml:space="preserve">. Blue cells are the reliable choices and orange cells are best avoided. Gray cells are used by good and poor scenarios alike, so they do not separate the two.</w:t>
       </w:r>
     </w:p>
     <w:p>
@@ -7030,7 +7234,203 @@
         <w:pStyle w:val="ListParagraph"/>
         <w:numPr>
           <w:ilvl w:val="0"/>
-          <w:numId w:val="12"/>
+          <w:numId w:val="13"/>
+        </w:numPr>
+      </w:pPr>
+      <w:r>
+        <w:t xml:space="preserve">Switch between </w:t>
+      </w:r>
+      <w:r>
+        <w:rPr>
+          <w:b/>
+        </w:rPr>
+        <w:t xml:space="preserve">Installed</w:t>
+      </w:r>
+      <w:r>
+        <w:t xml:space="preserve"> and </w:t>
+      </w:r>
+      <w:r>
+        <w:rPr>
+          <w:b/>
+        </w:rPr>
+        <w:t xml:space="preserve">Decommissioned</w:t>
+      </w:r>
+      <w:r>
+        <w:t xml:space="preserve"> to see where structure was added or removed.</w:t>
+      </w:r>
+    </w:p>
+    <w:p>
+      <w:pPr>
+        <w:pStyle w:val="ListParagraph"/>
+        <w:numPr>
+          <w:ilvl w:val="0"/>
+          <w:numId w:val="13"/>
+        </w:numPr>
+      </w:pPr>
+      <w:r>
+        <w:t xml:space="preserve">The table lists the cells most favoured by the top scenarios over the bottom ones, with the share of each group and of all scenarios, the map colour, and the mean number of modules the top scenarios placed there. </w:t>
+      </w:r>
+      <w:r>
+        <w:rPr>
+          <w:b/>
+        </w:rPr>
+        <w:t xml:space="preserve">Download cells (.csv)</w:t>
+      </w:r>
+      <w:r>
+        <w:t xml:space="preserve"> saves every cell.</w:t>
+      </w:r>
+    </w:p>
+    <w:p>
+      <w:pPr/>
+      <w:r>
+        <w:t xml:space="preserve">Caveats:</w:t>
+      </w:r>
+    </w:p>
+    <w:p>
+      <w:pPr>
+        <w:pStyle w:val="ListParagraph"/>
+        <w:numPr>
+          <w:ilvl w:val="0"/>
+          <w:numId w:val="14"/>
+        </w:numPr>
+      </w:pPr>
+      <w:r>
+        <w:t xml:space="preserve">Evolutionary scenarios copy most of their parent's cells, so the top group can look more consistent than it is. Tick </w:t>
+      </w:r>
+      <w:r>
+        <w:rPr>
+          <w:b/>
+        </w:rPr>
+        <w:t xml:space="preserve">Random runs only</w:t>
+      </w:r>
+      <w:r>
+        <w:t xml:space="preserve"> to check the pattern on independent scenarios.</w:t>
+      </w:r>
+    </w:p>
+    <w:p>
+      <w:pPr>
+        <w:pStyle w:val="ListParagraph"/>
+        <w:numPr>
+          <w:ilvl w:val="0"/>
+          <w:numId w:val="14"/>
+        </w:numPr>
+      </w:pPr>
+      <w:r>
+        <w:t xml:space="preserve">Bigger projects use more cells, so cells are common in high-budget scenarios regardless of location. Compare a cell's top share with its share across all scenarios.</w:t>
+      </w:r>
+    </w:p>
+    <w:p>
+      <w:pPr>
+        <w:pStyle w:val="ListParagraph"/>
+        <w:numPr>
+          <w:ilvl w:val="0"/>
+          <w:numId w:val="14"/>
+        </w:numPr>
+      </w:pPr>
+      <w:r>
+        <w:t xml:space="preserve">With random placement over many eligible cells, few cells reach a 50% cut-off until a session has a few hundred scenarios or the search has converged. Lower the cut-off to see the emerging pattern. At least 10 scored scenarios are needed.</w:t>
+      </w:r>
+    </w:p>
+    <w:p>
+      <w:pPr>
+        <w:pStyle w:val="Heading2"/>
+      </w:pPr>
+      <w:r>
+        <w:t xml:space="preserve">10. How the Solver works</w:t>
+      </w:r>
+    </w:p>
+    <w:p>
+      <w:pPr/>
+      <w:r>
+        <w:t xml:space="preserve">This section documents the calculations behind each scenario for readers who want to evaluate or reproduce the method. Symbols refer to the settings in Section 7.</w:t>
+      </w:r>
+    </w:p>
+    <w:p>
+      <w:pPr>
+        <w:pStyle w:val="Heading3"/>
+      </w:pPr>
+      <w:r>
+        <w:t xml:space="preserve">10.1 Existing reef baseline</w:t>
+      </w:r>
+    </w:p>
+    <w:p>
+      <w:pPr/>
+      <w:r>
+        <w:t xml:space="preserve">The status-quo reef cover is built from the Florida Fish and Wildlife Conservation Commission's artificial reef deployment records (</w:t>
+      </w:r>
+      <w:r>
+        <w:rPr>
+          <w:rStyle w:val="CodeChar"/>
+        </w:rPr>
+        <w:t xml:space="preserve">reeflocations.csv</w:t>
+      </w:r>
+      <w:r>
+        <w:t xml:space="preserve">), as in the original optimisation workflow:</w:t>
+      </w:r>
+    </w:p>
+    <w:p>
+      <w:pPr>
+        <w:pStyle w:val="ListParagraph"/>
+        <w:numPr>
+          <w:ilvl w:val="0"/>
+          <w:numId w:val="15"/>
+        </w:numPr>
+      </w:pPr>
+      <w:r>
+        <w:t xml:space="preserve">Each deployment with coordinates inside the model grid (1,126 of 4,548 records for NGoM) is assigned to its cell.</w:t>
+      </w:r>
+    </w:p>
+    <w:p>
+      <w:pPr>
+        <w:pStyle w:val="ListParagraph"/>
+        <w:numPr>
+          <w:ilvl w:val="0"/>
+          <w:numId w:val="15"/>
+        </w:numPr>
+      </w:pPr>
+      <w:r>
+        <w:t xml:space="preserve">Each cell is divided into a 10 m sub-grid. A deployment covers every sub-grid point within the halo radius (default 500 m) of its position.</w:t>
+      </w:r>
+    </w:p>
+    <w:p>
+      <w:pPr>
+        <w:pStyle w:val="ListParagraph"/>
+        <w:numPr>
+          <w:ilvl w:val="0"/>
+          <w:numId w:val="15"/>
+        </w:numPr>
+      </w:pPr>
+      <w:r>
+        <w:t xml:space="preserve">A cell's reef cover is the share of its sub-grid points covered by at least one deployment.</w:t>
+      </w:r>
+    </w:p>
+    <w:p>
+      <w:pPr>
+        <w:pStyle w:val="ListParagraph"/>
+        <w:numPr>
+          <w:ilvl w:val="0"/>
+          <w:numId w:val="15"/>
+        </w:numPr>
+      </w:pPr>
+      <w:r>
+        <w:t xml:space="preserve">The Alabama Artificial Reef Zone has no point data. Its reef cells, those marked in </w:t>
+      </w:r>
+      <w:r>
+        <w:rPr>
+          <w:rStyle w:val="CodeChar"/>
+        </w:rPr>
+        <w:t xml:space="preserve">structures_init.asc</w:t>
+      </w:r>
+      <w:r>
+        <w:t xml:space="preserve"> in the 19 westernmost columns, receive the mean cover of the Florida reef cells (15.9% with the defaults).</w:t>
+      </w:r>
+    </w:p>
+    <w:p>
+      <w:pPr>
+        <w:pStyle w:val="ListParagraph"/>
+        <w:numPr>
+          <w:ilvl w:val="0"/>
+          <w:numId w:val="15"/>
         </w:numPr>
       </w:pPr>
       <w:r>
@@ -7601,7 +8001,7 @@
         <w:pStyle w:val="ListParagraph"/>
         <w:numPr>
           <w:ilvl w:val="0"/>
-          <w:numId w:val="13"/>
+          <w:numId w:val="16"/>
         </w:numPr>
       </w:pPr>
       <w:r>
@@ -7613,7 +8013,7 @@
         <w:pStyle w:val="ListParagraph"/>
         <w:numPr>
           <w:ilvl w:val="0"/>
-          <w:numId w:val="13"/>
+          <w:numId w:val="16"/>
         </w:numPr>
       </w:pPr>
       <w:r>
@@ -7634,7 +8034,7 @@
         <w:pStyle w:val="ListParagraph"/>
         <w:numPr>
           <w:ilvl w:val="0"/>
-          <w:numId w:val="13"/>
+          <w:numId w:val="16"/>
         </w:numPr>
       </w:pPr>
       <w:r>
@@ -7646,7 +8046,7 @@
         <w:pStyle w:val="ListParagraph"/>
         <w:numPr>
           <w:ilvl w:val="0"/>
-          <w:numId w:val="13"/>
+          <w:numId w:val="16"/>
         </w:numPr>
       </w:pPr>
       <w:r>
@@ -7667,7 +8067,7 @@
         <w:pStyle w:val="ListParagraph"/>
         <w:numPr>
           <w:ilvl w:val="0"/>
-          <w:numId w:val="13"/>
+          <w:numId w:val="16"/>
         </w:numPr>
       </w:pPr>
       <w:r>
@@ -7679,7 +8079,7 @@
         <w:pStyle w:val="ListParagraph"/>
         <w:numPr>
           <w:ilvl w:val="0"/>
-          <w:numId w:val="13"/>
+          <w:numId w:val="16"/>
         </w:numPr>
       </w:pPr>
       <w:r>
@@ -7691,7 +8091,7 @@
         <w:pStyle w:val="ListParagraph"/>
         <w:numPr>
           <w:ilvl w:val="0"/>
-          <w:numId w:val="13"/>
+          <w:numId w:val="16"/>
         </w:numPr>
       </w:pPr>
       <w:r>
@@ -8676,7 +9076,7 @@
         <w:pStyle w:val="ListParagraph"/>
         <w:numPr>
           <w:ilvl w:val="0"/>
-          <w:numId w:val="14"/>
+          <w:numId w:val="17"/>
         </w:numPr>
       </w:pPr>
       <w:r>
@@ -8706,7 +9106,7 @@
         <w:pStyle w:val="ListParagraph"/>
         <w:numPr>
           <w:ilvl w:val="0"/>
-          <w:numId w:val="14"/>
+          <w:numId w:val="17"/>
         </w:numPr>
       </w:pPr>
       <w:r>
@@ -8736,7 +9136,7 @@
         <w:pStyle w:val="ListParagraph"/>
         <w:numPr>
           <w:ilvl w:val="0"/>
-          <w:numId w:val="14"/>
+          <w:numId w:val="17"/>
         </w:numPr>
       </w:pPr>
       <w:r>
@@ -8748,7 +9148,7 @@
         <w:pStyle w:val="ListParagraph"/>
         <w:numPr>
           <w:ilvl w:val="0"/>
-          <w:numId w:val="14"/>
+          <w:numId w:val="17"/>
         </w:numPr>
       </w:pPr>
       <w:r>
@@ -9043,7 +9443,7 @@
         <w:pStyle w:val="ListParagraph"/>
         <w:numPr>
           <w:ilvl w:val="0"/>
-          <w:numId w:val="15"/>
+          <w:numId w:val="18"/>
         </w:numPr>
       </w:pPr>
       <w:r>
@@ -9064,7 +9464,7 @@
         <w:pStyle w:val="ListParagraph"/>
         <w:numPr>
           <w:ilvl w:val="0"/>
-          <w:numId w:val="15"/>
+          <w:numId w:val="18"/>
         </w:numPr>
       </w:pPr>
       <w:r>
@@ -9076,7 +9476,7 @@
         <w:pStyle w:val="ListParagraph"/>
         <w:numPr>
           <w:ilvl w:val="0"/>
-          <w:numId w:val="15"/>
+          <w:numId w:val="18"/>
         </w:numPr>
       </w:pPr>
       <w:r>
@@ -9097,7 +9497,7 @@
         <w:pStyle w:val="ListParagraph"/>
         <w:numPr>
           <w:ilvl w:val="0"/>
-          <w:numId w:val="16"/>
+          <w:numId w:val="19"/>
         </w:numPr>
       </w:pPr>
       <w:r>
@@ -9109,7 +9509,7 @@
         <w:pStyle w:val="ListParagraph"/>
         <w:numPr>
           <w:ilvl w:val="0"/>
-          <w:numId w:val="16"/>
+          <w:numId w:val="19"/>
         </w:numPr>
       </w:pPr>
       <w:r>
@@ -9121,7 +9521,7 @@
         <w:pStyle w:val="ListParagraph"/>
         <w:numPr>
           <w:ilvl w:val="0"/>
-          <w:numId w:val="16"/>
+          <w:numId w:val="19"/>
         </w:numPr>
       </w:pPr>
       <w:r>
@@ -9352,27 +9752,36 @@
     <w:abstractNumId w:val="0"/>
   </w:num>
   <w:num w:numId="12">
+    <w:abstractNumId w:val="0"/>
+  </w:num>
+  <w:num w:numId="13">
+    <w:abstractNumId w:val="0"/>
+  </w:num>
+  <w:num w:numId="14">
+    <w:abstractNumId w:val="0"/>
+  </w:num>
+  <w:num w:numId="15">
     <w:abstractNumId w:val="1"/>
     <w:lvlOverride w:ilvl="0">
       <w:startOverride w:val="1"/>
     </w:lvlOverride>
   </w:num>
-  <w:num w:numId="13">
+  <w:num w:numId="16">
     <w:abstractNumId w:val="1"/>
     <w:lvlOverride w:ilvl="0">
       <w:startOverride w:val="1"/>
     </w:lvlOverride>
   </w:num>
-  <w:num w:numId="14">
+  <w:num w:numId="17">
     <w:abstractNumId w:val="1"/>
     <w:lvlOverride w:ilvl="0">
       <w:startOverride w:val="1"/>
     </w:lvlOverride>
   </w:num>
-  <w:num w:numId="15">
+  <w:num w:numId="18">
     <w:abstractNumId w:val="0"/>
   </w:num>
-  <w:num w:numId="16">
+  <w:num w:numId="19">
     <w:abstractNumId w:val="0"/>
   </w:num>
 </w:numbering>

</xml_diff>